<commit_message>
fix: preserve frozen mesh axes and close T2-26 verification
</commit_message>
<xml_diff>
--- a/docs/evidence/plan2/T2-26/mesh.docx
+++ b/docs/evidence/plan2/T2-26/mesh.docx
@@ -383,7 +383,7 @@
         <w:spacing w:after="130"/>
       </w:pPr>
       <w:r>
-        <w:t xml:space="preserve">项目 T2-25 固定－铰接梁；项目 ID project_1cf605e4-fb10-4d55-9afe-699be1319d73</w:t>
+        <w:t xml:space="preserve">项目 T2-25 固定－铰接梁；项目 ID project_a8c0133a-9de1-4683-9f62-b33aecad8d1e</w:t>
       </w:r>
     </w:p>
     <w:p>
@@ -391,7 +391,7 @@
         <w:spacing w:after="130"/>
       </w:pPr>
       <w:r>
-        <w:t xml:space="preserve">分析 ID analysis_e574c05a-ccbc-4af2-b6cf-0225b9f41315；输入修订 R11；状态 已完成</w:t>
+        <w:t xml:space="preserve">分析 ID analysis_a974ac97-0b7a-4f47-9153-6d65b855df04；输入修订 R11；状态 已完成</w:t>
       </w:r>
     </w:p>
     <w:p>
@@ -399,7 +399,7 @@
         <w:spacing w:after="130"/>
       </w:pPr>
       <w:r>
-        <w:t xml:space="preserve">分析时间 2026-10-06T09:00:29Z；报告生成时间 2026-10-06T09:00:30.192Z（ISO 8601）</w:t>
+        <w:t xml:space="preserve">分析时间 2026-10-06T09:15:22Z；报告生成时间 2026-10-06T09:15:22.868Z（ISO 8601）</w:t>
       </w:r>
     </w:p>
     <w:p>
@@ -407,7 +407,7 @@
         <w:spacing w:after="130"/>
       </w:pPr>
       <w:r>
-        <w:t xml:space="preserve">运行来源 formal-model；请求 request_3e86e655-0b5b-4846-bb60-7e0737b9d9c0；实际阶段 模型检查 (2026-10-06T09:00:29Z) → 刚度组装 (2026-10-06T09:00:29Z) → 方程求解 (2026-10-06T09:00:29Z) → 结果恢复 (2026-10-06T09:00:29Z)。</w:t>
+        <w:t xml:space="preserve">运行来源 formal-model；请求 request_4d5b19ea-eb8a-4cda-82a8-e94a92847e1c；实际阶段 模型检查 (2026-10-06T09:15:22Z) → 刚度组装 (2026-10-06T09:15:22Z) → 方程求解 (2026-10-06T09:15:22Z) → 结果恢复 (2026-10-06T09:15:22Z)。</w:t>
       </w:r>
     </w:p>
     <w:p>
@@ -5134,7 +5134,7 @@
         <w:spacing w:after="130"/>
       </w:pPr>
       <w:r>
-        <w:t xml:space="preserve">正文来源分析 analysis_e574c05a-ccbc-4af2-b6cf-0225b9f41315；输入修订 R11；LC1 · 默认工况。</w:t>
+        <w:t xml:space="preserve">正文来源分析 analysis_a974ac97-0b7a-4f47-9153-6d65b855df04；输入修订 R11；LC1 · 默认工况。</w:t>
       </w:r>
     </w:p>
     <w:p>
@@ -5176,7 +5176,7 @@
         <w:spacing w:after="130"/>
       </w:pPr>
       <w:r>
-        <w:t xml:space="preserve">按冻结输入重建 · 分析 analysis_e574c05a-ccbc-4af2-b6cf-0225b9f41315；位移与杆端力来自该分析的已保存结果。</w:t>
+        <w:t xml:space="preserve">按冻结输入重建 · 分析 analysis_a974ac97-0b7a-4f47-9153-6d65b855df04；位移与杆端力来自该分析的已保存结果。</w:t>
       </w:r>
     </w:p>
     <w:p>
@@ -28542,7 +28542,7 @@
         <w:spacing w:after="130"/>
       </w:pPr>
       <w:r>
-        <w:t xml:space="preserve">本次运行实际快照 · 分析 analysis_e574c05a-ccbc-4af2-b6cf-0225b9f41315</w:t>
+        <w:t xml:space="preserve">本次运行实际快照 · 分析 analysis_a974ac97-0b7a-4f47-9153-6d65b855df04</w:t>
       </w:r>
     </w:p>
     <w:p>

</xml_diff>